<commit_message>
docs: add cover logo, page numbers, and auto table of contents
- build_docs.py: BTSC logo on cover, footer "หน้า X / N" (PAGE/NUMPAGES
  fields), Word TOC field, and updateFields so Word refreshes on open;
  new [[TOC]] markdown token.
- All three docs (Full manual, short manual, SRS) rebuilt with these.

Co-Authored-By: Claude Opus 4.8 (1M context) <noreply@anthropic.com>
</commit_message>
<xml_diff>
--- a/docs/RoPA_Manual_TH.docx
+++ b/docs/RoPA_Manual_TH.docx
@@ -2,6 +2,45 @@
 <file path=word/document.xml><?xml version="1.0" encoding="utf-8"?>
 <w:document xmlns:wpc="http://schemas.microsoft.com/office/word/2010/wordprocessingCanvas" xmlns:mo="http://schemas.microsoft.com/office/mac/office/2008/main" xmlns:mc="http://schemas.openxmlformats.org/markup-compatibility/2006" xmlns:mv="urn:schemas-microsoft-com:mac:vml" xmlns:o="urn:schemas-microsoft-com:office:office" xmlns:r="http://schemas.openxmlformats.org/officeDocument/2006/relationships" xmlns:m="http://schemas.openxmlformats.org/officeDocument/2006/math" xmlns:v="urn:schemas-microsoft-com:vml" xmlns:wp14="http://schemas.microsoft.com/office/word/2010/wordprocessingDrawing" xmlns:wp="http://schemas.openxmlformats.org/drawingml/2006/wordprocessingDrawing" xmlns:w10="urn:schemas-microsoft-com:office:word" xmlns:w="http://schemas.openxmlformats.org/wordprocessingml/2006/main" xmlns:w14="http://schemas.microsoft.com/office/word/2010/wordml" xmlns:wpg="http://schemas.microsoft.com/office/word/2010/wordprocessingGroup" xmlns:wpi="http://schemas.microsoft.com/office/word/2010/wordprocessingInk" xmlns:wne="http://schemas.microsoft.com/office/word/2006/wordml" xmlns:wps="http://schemas.microsoft.com/office/word/2010/wordprocessingShape" mc:Ignorable="w14 wp14">
   <w:body>
+    <w:p>
+      <w:pPr>
+        <w:jc w:val="center"/>
+      </w:pPr>
+      <w:r>
+        <w:drawing>
+          <wp:inline xmlns:a="http://schemas.openxmlformats.org/drawingml/2006/main" xmlns:pic="http://schemas.openxmlformats.org/drawingml/2006/picture">
+            <wp:extent cx="1554480" cy="1875306"/>
+            <wp:docPr id="1" name="Picture 1"/>
+            <wp:cNvGraphicFramePr>
+              <a:graphicFrameLocks noChangeAspect="1"/>
+            </wp:cNvGraphicFramePr>
+            <a:graphic>
+              <a:graphicData uri="http://schemas.openxmlformats.org/drawingml/2006/picture">
+                <pic:pic>
+                  <pic:nvPicPr>
+                    <pic:cNvPr id="0" name="btsc-logo-transparent.png"/>
+                    <pic:cNvPicPr/>
+                  </pic:nvPicPr>
+                  <pic:blipFill>
+                    <a:blip r:embed="rId10"/>
+                    <a:stretch>
+                      <a:fillRect/>
+                    </a:stretch>
+                  </pic:blipFill>
+                  <pic:spPr>
+                    <a:xfrm>
+                      <a:off x="0" y="0"/>
+                      <a:ext cx="1554480" cy="1875306"/>
+                    </a:xfrm>
+                    <a:prstGeom prst="rect"/>
+                  </pic:spPr>
+                </pic:pic>
+              </a:graphicData>
+            </a:graphic>
+          </wp:inline>
+        </w:drawing>
+      </w:r>
+    </w:p>
     <w:p>
       <w:pPr>
         <w:jc w:val="center"/>
@@ -38,7 +77,7 @@
           <w:rFonts w:ascii="TH Sarabun New" w:hAnsi="TH Sarabun New" w:cs="TH Sarabun New" w:eastAsia="TH Sarabun New"/>
           <w:sz w:val="26"/>
         </w:rPr>
-        <w:t>จัดทำเมื่อ 24/06/2026</w:t>
+        <w:t>จัดทำเมื่อ 25/06/2026</w:t>
       </w:r>
     </w:p>
     <w:p>
@@ -76,6 +115,34 @@
     <w:p>
       <w:r>
         <w:t>——————————————————————————————</w:t>
+      </w:r>
+    </w:p>
+    <w:p>
+      <w:pPr>
+        <w:pStyle w:val="Heading2"/>
+      </w:pPr>
+      <w:r>
+        <w:rPr>
+          <w:rFonts w:ascii="TH Sarabun New" w:hAnsi="TH Sarabun New" w:cs="TH Sarabun New" w:eastAsia="TH Sarabun New"/>
+        </w:rPr>
+        <w:t>สารบัญ</w:t>
+      </w:r>
+    </w:p>
+    <w:p>
+      <w:r>
+        <w:rPr>
+          <w:rFonts w:ascii="TH Sarabun New" w:hAnsi="TH Sarabun New" w:cs="TH Sarabun New" w:eastAsia="TH Sarabun New"/>
+        </w:rPr>
+        <w:fldChar w:fldCharType="begin"/>
+        <w:instrText xml:space="preserve">TOC \o "1-3" \h \z \u</w:instrText>
+        <w:fldChar w:fldCharType="separate"/>
+        <w:t>(สารบัญจะสร้างอัตโนมัติเมื่อเปิดไฟล์ · หากไม่ขึ้น คลิกขวาที่นี่ &gt; Update Field)</w:t>
+        <w:fldChar w:fldCharType="end"/>
+      </w:r>
+    </w:p>
+    <w:p>
+      <w:r>
+        <w:br w:type="page"/>
       </w:r>
     </w:p>
     <w:p>
@@ -2073,6 +2140,7 @@
       </w:r>
     </w:p>
     <w:sectPr>
+      <w:footerReference w:type="default" r:id="rId9"/>
       <w:pgSz w:w="12240" w:h="15840"/>
       <w:pgMar w:top="1440" w:right="1800" w:bottom="1440" w:left="1800" w:header="720" w:footer="720" w:gutter="0"/>
       <w:cols w:space="720"/>
@@ -2080,6 +2148,57 @@
     </w:sectPr>
   </w:body>
 </w:document>
+</file>
+
+<file path=word/footer1.xml><?xml version="1.0" encoding="utf-8"?>
+<w:ftr xmlns:m="http://schemas.openxmlformats.org/officeDocument/2006/math" xmlns:mc="http://schemas.openxmlformats.org/markup-compatibility/2006" xmlns:mo="http://schemas.microsoft.com/office/mac/office/2008/main" xmlns:mv="urn:schemas-microsoft-com:mac:vml" xmlns:o="urn:schemas-microsoft-com:office:office" xmlns:r="http://schemas.openxmlformats.org/officeDocument/2006/relationships" xmlns:v="urn:schemas-microsoft-com:vml" xmlns:w10="urn:schemas-microsoft-com:office:word" xmlns:w14="http://schemas.microsoft.com/office/word/2010/wordml" xmlns:w="http://schemas.openxmlformats.org/wordprocessingml/2006/main" xmlns:wne="http://schemas.microsoft.com/office/word/2006/wordml" xmlns:wp14="http://schemas.microsoft.com/office/word/2010/wordprocessingDrawing" xmlns:wp="http://schemas.openxmlformats.org/drawingml/2006/wordprocessingDrawing" xmlns:wpc="http://schemas.microsoft.com/office/word/2010/wordprocessingCanvas" xmlns:wpg="http://schemas.microsoft.com/office/word/2010/wordprocessingGroup" xmlns:wpi="http://schemas.microsoft.com/office/word/2010/wordprocessingInk" xmlns:wps="http://schemas.microsoft.com/office/word/2010/wordprocessingShape" mc:Ignorable="w14 wp14">
+  <w:p>
+    <w:pPr>
+      <w:pStyle w:val="Footer"/>
+      <w:jc w:val="center"/>
+    </w:pPr>
+    <w:r>
+      <w:rPr>
+        <w:rFonts w:ascii="TH Sarabun New" w:hAnsi="TH Sarabun New" w:cs="TH Sarabun New" w:eastAsia="TH Sarabun New"/>
+        <w:color w:val="6B7785"/>
+        <w:sz w:val="24"/>
+      </w:rPr>
+      <w:t xml:space="preserve">หน้า </w:t>
+    </w:r>
+    <w:r>
+      <w:rPr>
+        <w:rFonts w:ascii="TH Sarabun New" w:hAnsi="TH Sarabun New" w:cs="TH Sarabun New" w:eastAsia="TH Sarabun New"/>
+        <w:color w:val="6B7785"/>
+        <w:sz w:val="24"/>
+      </w:rPr>
+      <w:fldChar w:fldCharType="begin"/>
+      <w:instrText xml:space="preserve">PAGE</w:instrText>
+      <w:fldChar w:fldCharType="separate"/>
+      <w:t>1</w:t>
+      <w:fldChar w:fldCharType="end"/>
+    </w:r>
+    <w:r>
+      <w:rPr>
+        <w:rFonts w:ascii="TH Sarabun New" w:hAnsi="TH Sarabun New" w:cs="TH Sarabun New" w:eastAsia="TH Sarabun New"/>
+        <w:color w:val="6B7785"/>
+        <w:sz w:val="24"/>
+      </w:rPr>
+      <w:t xml:space="preserve"> / </w:t>
+    </w:r>
+    <w:r>
+      <w:rPr>
+        <w:rFonts w:ascii="TH Sarabun New" w:hAnsi="TH Sarabun New" w:cs="TH Sarabun New" w:eastAsia="TH Sarabun New"/>
+        <w:color w:val="6B7785"/>
+        <w:sz w:val="24"/>
+      </w:rPr>
+      <w:fldChar w:fldCharType="begin"/>
+      <w:instrText xml:space="preserve">NUMPAGES</w:instrText>
+      <w:fldChar w:fldCharType="separate"/>
+      <w:t>1</w:t>
+      <w:fldChar w:fldCharType="end"/>
+    </w:r>
+  </w:p>
+</w:ftr>
 </file>
 
 <file path=word/numbering.xml><?xml version="1.0" encoding="utf-8"?>

</xml_diff>

<commit_message>
docs: add BTSC logo to page header on every page
Header now shows the logo (left) + document title (right) with a divider
line, repeated on all pages. Rebuilt all three docs.

Co-Authored-By: Claude Opus 4.8 (1M context) <noreply@anthropic.com>
</commit_message>
<xml_diff>
--- a/docs/RoPA_Manual_TH.docx
+++ b/docs/RoPA_Manual_TH.docx
@@ -22,7 +22,7 @@
                     <pic:cNvPicPr/>
                   </pic:nvPicPr>
                   <pic:blipFill>
-                    <a:blip r:embed="rId10"/>
+                    <a:blip r:embed="rId11"/>
                     <a:stretch>
                       <a:fillRect/>
                     </a:stretch>
@@ -2140,7 +2140,8 @@
       </w:r>
     </w:p>
     <w:sectPr>
-      <w:footerReference w:type="default" r:id="rId9"/>
+      <w:headerReference w:type="default" r:id="rId9"/>
+      <w:footerReference w:type="default" r:id="rId10"/>
       <w:pgSz w:w="12240" w:h="15840"/>
       <w:pgMar w:top="1440" w:right="1800" w:bottom="1440" w:left="1800" w:header="720" w:footer="720" w:gutter="0"/>
       <w:cols w:space="720"/>
@@ -2199,6 +2200,65 @@
     </w:r>
   </w:p>
 </w:ftr>
+</file>
+
+<file path=word/header1.xml><?xml version="1.0" encoding="utf-8"?>
+<w:hdr xmlns:m="http://schemas.openxmlformats.org/officeDocument/2006/math" xmlns:mc="http://schemas.openxmlformats.org/markup-compatibility/2006" xmlns:mo="http://schemas.microsoft.com/office/mac/office/2008/main" xmlns:mv="urn:schemas-microsoft-com:mac:vml" xmlns:o="urn:schemas-microsoft-com:office:office" xmlns:r="http://schemas.openxmlformats.org/officeDocument/2006/relationships" xmlns:v="urn:schemas-microsoft-com:vml" xmlns:w10="urn:schemas-microsoft-com:office:word" xmlns:w14="http://schemas.microsoft.com/office/word/2010/wordml" xmlns:w="http://schemas.openxmlformats.org/wordprocessingml/2006/main" xmlns:wne="http://schemas.microsoft.com/office/word/2006/wordml" xmlns:wp14="http://schemas.microsoft.com/office/word/2010/wordprocessingDrawing" xmlns:wp="http://schemas.openxmlformats.org/drawingml/2006/wordprocessingDrawing" xmlns:wpc="http://schemas.microsoft.com/office/word/2010/wordprocessingCanvas" xmlns:wpg="http://schemas.microsoft.com/office/word/2010/wordprocessingGroup" xmlns:wpi="http://schemas.microsoft.com/office/word/2010/wordprocessingInk" xmlns:wps="http://schemas.microsoft.com/office/word/2010/wordprocessingShape" mc:Ignorable="w14 wp14">
+  <w:p>
+    <w:pPr>
+      <w:pStyle w:val="Header"/>
+      <w:pBdr>
+        <w:bottom w:val="single" w:sz="6" w:space="4" w:color="B0B8C4"/>
+      </w:pBdr>
+    </w:pPr>
+    <w:r>
+      <w:drawing>
+        <wp:inline xmlns:a="http://schemas.openxmlformats.org/drawingml/2006/main" xmlns:pic="http://schemas.openxmlformats.org/drawingml/2006/picture">
+          <wp:extent cx="318345" cy="384048"/>
+          <wp:docPr id="1" name="Picture 1"/>
+          <wp:cNvGraphicFramePr>
+            <a:graphicFrameLocks noChangeAspect="1"/>
+          </wp:cNvGraphicFramePr>
+          <a:graphic>
+            <a:graphicData uri="http://schemas.openxmlformats.org/drawingml/2006/picture">
+              <pic:pic>
+                <pic:nvPicPr>
+                  <pic:cNvPr id="0" name="btsc-logo-transparent.png"/>
+                  <pic:cNvPicPr/>
+                </pic:nvPicPr>
+                <pic:blipFill>
+                  <a:blip r:embed="rId1"/>
+                  <a:stretch>
+                    <a:fillRect/>
+                  </a:stretch>
+                </pic:blipFill>
+                <pic:spPr>
+                  <a:xfrm>
+                    <a:off x="0" y="0"/>
+                    <a:ext cx="318345" cy="384048"/>
+                  </a:xfrm>
+                  <a:prstGeom prst="rect"/>
+                </pic:spPr>
+              </pic:pic>
+            </a:graphicData>
+          </a:graphic>
+        </wp:inline>
+      </w:drawing>
+    </w:r>
+    <w:r>
+      <w:tab/>
+      <w:tab/>
+    </w:r>
+    <w:r>
+      <w:rPr>
+        <w:rFonts w:ascii="TH Sarabun New" w:hAnsi="TH Sarabun New" w:cs="TH Sarabun New" w:eastAsia="TH Sarabun New"/>
+        <w:color w:val="6B7785"/>
+        <w:sz w:val="22"/>
+      </w:rPr>
+      <w:t>คู่มือการใช้งานระบบ RoPA</w:t>
+    </w:r>
+  </w:p>
+</w:hdr>
 </file>
 
 <file path=word/numbering.xml><?xml version="1.0" encoding="utf-8"?>

</xml_diff>